<commit_message>
docs(fd03-fd04): add ER diagram figure and cross-reference
FD04 SAD lacked a logical entity-relationship diagram despite describing
the MongoDB collections in prose; embed the updated ER diagram (10
collections including ALERTS/AUTOMATIC_REPORTS) as Figura 124 in section
10.1, and reference it from FD03 SRS.

Co-Authored-By: Claude Sonnet 5 <noreply@anthropic.com>
</commit_message>
<xml_diff>
--- a/Documentation/FD04-EPIS-Informe SAD de Proyecto.docx
+++ b/Documentation/FD04-EPIS-Informe SAD de Proyecto.docx
@@ -9264,7 +9264,7 @@
         <w:jc w:val="both"/>
       </w:pPr>
       <w:r>
-        <w:t>Los diagramas C4 del sistema (contexto, contenedor y componente) y el modelo entidad-relación se mantienen como diagramas interactivos en el repositorio del proyecto y se actualizan junto con el software.</w:t>
+        <w:t>Los diagramas C4 del sistema (contexto, contenedor y componente) se mantienen como diagramas interactivos en el repositorio del proyecto y se actualizan junto con el software. El diagrama de entidad-relación lógico se documenta como Figura 124 en la Sección 10.1 (Vista de Datos).</w:t>
       </w:r>
     </w:p>
     <w:p>
@@ -16683,6 +16683,73 @@
           <w:lang w:val="en-US"/>
         </w:rPr>
         <w:t>{ patientId: 1 }, { tipo: 1 }, { leida: 1 }.</w:t>
+      </w:r>
+    </w:p>
+    <w:p>
+      <w:pPr>
+        <w:spacing w:before="120" w:after="120" w:line="276" w:lineRule="auto"/>
+        <w:jc w:val="both"/>
+      </w:pPr>
+      <w:r>
+        <w:t>Adicionalmente a las colecciones descritas, la Figura 124 presenta el diagrama de entidad-relación lógico completo del sistema, incluyendo las diez colecciones de la base de datos MongoDB (USERS, MEDICAL_HISTORY, SYMPTOM_REPORTS, AI_ANALYSES, CHAT_CONVERSATIONS, CHAT_MESSAGES, SYMPTOM_ITEMS, ANALYTICS, ALERTS y AUTOMATIC_REPORTS), sus campos, claves primarias/foráneas y relaciones de cardinalidad. La fuente editable (Mermaid) se mantiene en el repositorio del proyecto (Documentation/Diagramas/DIAGRAMAS_MERMAID.md) y se actualiza junto con el software.</w:t>
+      </w:r>
+    </w:p>
+    <w:p>
+      <w:pPr>
+        <w:spacing w:before="120" w:after="60"/>
+        <w:jc w:val="center"/>
+      </w:pPr>
+      <w:r>
+        <w:drawing>
+          <wp:inline distT="0" distB="0" distL="0" distR="0">
+            <wp:extent cx="5486400" cy="3275311"/>
+            <wp:effectExtent l="0" t="0" r="0" b="0"/>
+            <wp:docPr id="1124" name="Figura 124"/>
+            <wp:cNvGraphicFramePr/>
+            <a:graphic xmlns:a="http://schemas.openxmlformats.org/drawingml/2006/main">
+              <a:graphicData uri="http://schemas.openxmlformats.org/drawingml/2006/picture">
+                <pic:pic xmlns:pic="http://schemas.openxmlformats.org/drawingml/2006/picture">
+                  <pic:nvPicPr>
+                    <pic:cNvPr id="1124" name="Figura 124"/>
+                    <pic:cNvPicPr/>
+                  </pic:nvPicPr>
+                  <pic:blipFill>
+                    <a:blip xmlns:r="http://schemas.openxmlformats.org/officeDocument/2006/relationships" r:embed="rId2124"/>
+                    <a:stretch>
+                      <a:fillRect/>
+                    </a:stretch>
+                  </pic:blipFill>
+                  <pic:spPr>
+                    <a:xfrm>
+                      <a:off x="0" y="0"/>
+                      <a:ext cx="5486400" cy="3275311"/>
+                    </a:xfrm>
+                    <a:prstGeom prst="rect">
+                      <a:avLst/>
+                    </a:prstGeom>
+                  </pic:spPr>
+                </pic:pic>
+              </a:graphicData>
+            </a:graphic>
+          </wp:inline>
+        </w:drawing>
+      </w:r>
+    </w:p>
+    <w:p>
+      <w:pPr>
+        <w:spacing w:after="180"/>
+        <w:jc w:val="center"/>
+        <w:rPr>
+          <w:i/>
+          <w:sz w:val="20"/>
+        </w:rPr>
+      </w:pPr>
+      <w:r>
+        <w:rPr>
+          <w:i/>
+          <w:sz w:val="20"/>
+        </w:rPr>
+        <w:t>Figura 124: Diagrama de Entidad-Relación (Modelo Lógico) — Base de Datos MongoDB — fase diseño</w:t>
       </w:r>
     </w:p>
     <w:p>

</xml_diff>